<commit_message>
fix loi + hoan thanh tai lieu
</commit_message>
<xml_diff>
--- a/Tài Liệu/1.BIACHINH.docx
+++ b/Tài Liệu/1.BIACHINH.docx
@@ -20034,8 +20034,6 @@
           <w:szCs w:val="36"/>
         </w:rPr>
       </w:pPr>
-      <w:bookmarkStart w:id="0" w:name="_GoBack"/>
-      <w:bookmarkEnd w:id="0"/>
       <w:r>
         <w:rPr>
           <w:b/>
@@ -20396,8 +20394,8 @@
           <w:color w:val="000000"/>
         </w:rPr>
       </w:pPr>
-      <w:bookmarkStart w:id="1" w:name="_gjdgxs" w:colFirst="0" w:colLast="0"/>
-      <w:bookmarkEnd w:id="1"/>
+      <w:bookmarkStart w:id="0" w:name="_gjdgxs" w:colFirst="0" w:colLast="0"/>
+      <w:bookmarkEnd w:id="0"/>
       <w:r>
         <w:rPr>
           <w:color w:val="000000"/>
@@ -20596,20 +20594,31 @@
       <w:pPr>
         <w:widowControl/>
         <w:spacing w:before="120" w:after="120"/>
-        <w:ind w:left="2475"/>
+        <w:ind w:left="2475" w:hanging="1482"/>
+        <w:jc w:val="center"/>
         <w:rPr>
           <w:b/>
           <w:sz w:val="28"/>
           <w:szCs w:val="28"/>
         </w:rPr>
       </w:pPr>
+      <w:bookmarkStart w:id="1" w:name="_GoBack"/>
       <w:r>
         <w:rPr>
           <w:b/>
           <w:sz w:val="28"/>
           <w:szCs w:val="28"/>
         </w:rPr>
-        <w:t xml:space="preserve">                  Đà Nẵng, </w:t>
+        <w:t xml:space="preserve">Đà Nẵng, </w:t>
+      </w:r>
+      <w:r>
+        <w:rPr>
+          <w:b/>
+          <w:sz w:val="28"/>
+          <w:szCs w:val="28"/>
+          <w:lang w:val="vi-VN"/>
+        </w:rPr>
+        <w:t xml:space="preserve">tháng 05 năm </w:t>
       </w:r>
       <w:r>
         <w:rPr>
@@ -20620,6 +20629,7 @@
         </w:rPr>
         <w:t>2026</w:t>
       </w:r>
+      <w:bookmarkEnd w:id="1"/>
     </w:p>
     <w:sectPr>
       <w:pgSz w:w="11900" w:h="16840"/>

</xml_diff>